<commit_message>
WP08/WP09: min. 3 dostawców w metodach, zakupy w 1. miesiącu zadania (M1-M30), weryfikacja cen, T36
Co-Authored-By: Claude Sonnet 5.5 <noreply@anthropic.com>
Claude-Session: https://claude.ai/code/session_01672WnJhixnEcarbb7uiwfx
</commit_message>
<xml_diff>
--- a/Sekcja_3.1_sprzet_i_amortyzacja.docx
+++ b/Sekcja_3.1_sprzet_i_amortyzacja.docx
@@ -2757,7 +2757,7 @@
           <w:color w:val="666666"/>
           <w:sz w:val="17"/>
         </w:rPr>
-        <w:t xml:space="preserve"> [1295 znaków]</w:t>
+        <w:t xml:space="preserve"> [1279 znaków]</w:t>
       </w:r>
     </w:p>
     <w:p>
@@ -2768,7 +2768,7 @@
         <w:rPr>
           <w:b w:val="0"/>
         </w:rPr>
-        <w:t>Koszt oszacowano na podstawie ogólnodostępnych cenników producentów i dystrybutorów sprzętu wizyjnego (Basler, Edmund Optics, dostęp 2026), np. kamera Basler ace 2 a2A1920-51gm kosztuje 319 EUR netto, czyli ok. 1 390 zł po kursie NBP 4,3632 z 17.09.2026. Wartość pozycji to iloczyn liczby sztuk i ceny jednostkowej netto: kamera EO IP/PoE, 4 szt. x 1 500 zł = 6 000 zł; obiektyw szerokokątny C/CS-mount, 4 szt. x 300 zł = 1 200 zł; oświetlacz LED, 4 szt. x 100 zł = 400 zł. Razem 7 600 zł netto, przy czym przyjęto ceny z cenników powiększone o zaokrąglenie, bez marginesu. Każdy komplet lub składnik zostanie ujęty w ewidencji jako odrębny środek trwały o wartości początkowej 1 900 zł netto, kompletny i zdatny do użytku. Wartość początkowa nie przekracza 10 000 zł, więc zgodnie z ustawą o rachunkowości i polityką rachunkowości Everest11 odpis nastąpi jednorazowo w miesiącu oddania do używania (stawka roczna 100%, okres amortyzacji 1 miesiąc, odpis miesięczny równy wartości początkowej). Środek będzie wykorzystywany w projekcie przez 21 miesięcy (M10-M30) wyłącznie do prac B+R, po M30 zostanie zlikwidowany protokołem likwidacji, a zakup nie jest współfinansowany z innych środków. Wydatek obejmuje zakup środka trwałego i jego odpis, a kwota kwalifikowalna to wartość początkowa netto.</w:t>
+        <w:t>Rozeznanie rynku objęło trzech dostawców kamer: Basler (a2A1920-51gm, 319 EUR netto), Edmund Optics (ta sama kamera w wersji Pro, 494 EUR) i Machine Vision Store (359 USD), a obiektywy porównano w cennikach Basler, Kowa i Edmund Optics (dostęp 01.10.2026). Po kursach NBP z 17.09.2026 (4,3632 PLN/EUR, 3,803 PLN/USD) kamera kosztuje od ok. 1 390 do ok. 2 150 zł. Wartość pozycji to iloczyn liczby sztuk i ceny jednostkowej netto: kamera EO IP/PoE, 4 szt. x 1 500 zł = 6 000 zł; obiektyw szerokokątny C/CS-mount, 4 szt. x 300 zł = 1 200 zł; oświetlacz LED, 4 szt. x 100 zł = 400 zł. Razem 7 600 zł netto, przy czym przyjęto ceny z cenników powiększone o zaokrąglenie, bez marginesu. Każdy komplet lub składnik jest odrębnym środkiem trwałym o wartości początkowej 1 900 zł netto, więc zgodnie z ustawą o rachunkowości i polityką rachunkowości Everest11 zostanie odpisany jednorazowo w miesiącu oddania do używania (stawka roczna 100%, okres amortyzacji 1 miesiąc, odpis równy wartości początkowej). Środek będzie używany w projekcie wyłącznie do prac B+R przez 30 miesięcy (M1-M30), po M30 zostanie zlikwidowany protokołem likwidacji, a zakup nie jest współfinansowany z innych środków. Kwota kwalifikowalna to wartość początkowa netto, a różnicę do ceny zakupu pokryje Everest11.</w:t>
       </w:r>
     </w:p>
     <w:p>
@@ -2847,7 +2847,7 @@
           <w:color w:val="666666"/>
           <w:sz w:val="17"/>
         </w:rPr>
-        <w:t xml:space="preserve"> [1387 znaków]</w:t>
+        <w:t xml:space="preserve"> [1258 znaków]</w:t>
       </w:r>
     </w:p>
     <w:p>
@@ -2858,7 +2858,7 @@
         <w:rPr>
           <w:b w:val="0"/>
         </w:rPr>
-        <w:t>Koszt oszacowano na podstawie ogólnodostępnych cenników producentów kamer głębi: Orbbec Femto Bolt (iToF, 0,25-5,46 m) kosztuje 559 USD, czyli ok. 2 130 zł po kursie NBP 3,803 z 17.09.2026, a przemysłowe kamery ToF Basler blaze i Lucid Helios2 kosztują od 1 579 EUR, czyli od ok. 6 900 zł (dostęp 01.10.2026). Wartość pozycji to iloczyn liczby sztuk i ceny jednostkowej netto: kamera ToF RGB-D klasy podstawowej, 4 szt. x 2 100 zł = 8 400 zł; akcesoria (uchwyt, przewód USB3, osłona), 4 szt. x 400 zł = 1 600 zł. Razem 10 000 zł netto. Przyjęto kamerę klasy podstawowej, bo zbiór in-transit wymaga wielu tanich czujników, a klasa przemysłowa jest badana w Z1 w PRz. Każdy komplet lub składnik zostanie ujęty w ewidencji jako odrębny środek trwały o wartości początkowej 2 500 zł netto, kompletny i zdatny do użytku. Wartość początkowa nie przekracza 10 000 zł, więc zgodnie z ustawą o rachunkowości i polityką rachunkowości Everest11 odpis nastąpi jednorazowo w miesiącu oddania do używania (stawka roczna 100%, okres amortyzacji 1 miesiąc, odpis miesięczny równy wartości początkowej). Środek będzie wykorzystywany w projekcie przez 21 miesięcy (M10-M30) wyłącznie do prac B+R, po M30 zostanie zlikwidowany protokołem likwidacji, a zakup nie jest współfinansowany z innych środków. Wydatek obejmuje zakup środka trwałego i jego odpis, a kwota kwalifikowalna to wartość początkowa netto.</w:t>
+        <w:t>Rozeznanie rynku objęło trzech dostawców kamer ToF: RobotShop (Orbbec Femto Bolt, 559 USD, czyli ok. 2 130 zł po kursie NBP 3,803 z 17.09.2026), Switch Science i oficjalny sklep Orbbec, a klasę przemysłową sprawdzono w cennikach Basler (blaze, 1 579 EUR) i Lucid (Helios2, 1 645 EUR) (dostęp 01.10.2026). Wartość pozycji to iloczyn liczby sztuk i ceny jednostkowej netto: kamera ToF RGB-D klasy podstawowej, 4 szt. x 2 100 zł = 8 400 zł; akcesoria (uchwyt, przewód USB3, osłona), 4 szt. x 400 zł = 1 600 zł. Razem 10 000 zł netto. Przyjęto kamerę klasy podstawowej, bo zbiór in-transit wymaga wielu tanich czujników, a klasa przemysłowa jest badana w Z1 w PRz. Każdy komplet lub składnik jest odrębnym środkiem trwałym o wartości początkowej 2 500 zł netto, więc zgodnie z ustawą o rachunkowości i polityką rachunkowości Everest11 zostanie odpisany jednorazowo w miesiącu oddania do używania (stawka roczna 100%, okres amortyzacji 1 miesiąc, odpis równy wartości początkowej). Środek będzie używany w projekcie wyłącznie do prac B+R przez 30 miesięcy (M1-M30), po M30 zostanie zlikwidowany protokołem likwidacji, a zakup nie jest współfinansowany z innych środków. Kwota kwalifikowalna to wartość początkowa netto, a różnicę do ceny zakupu pokryje Everest11.</w:t>
       </w:r>
     </w:p>
     <w:p>
@@ -2937,7 +2937,7 @@
           <w:color w:val="666666"/>
           <w:sz w:val="17"/>
         </w:rPr>
-        <w:t xml:space="preserve"> [1134 znaków]</w:t>
+        <w:t xml:space="preserve"> [1022 znaków]</w:t>
       </w:r>
     </w:p>
     <w:p>
@@ -2948,7 +2948,7 @@
         <w:rPr>
           <w:b w:val="0"/>
         </w:rPr>
-        <w:t>Koszt oszacowano na podstawie cenników dystrybutorów komponentów radarowych (Digi-Key, Mouser, dostęp 2026) dla modułów FMCW mmWave z interfejsem SPI i wyjściem chmury punktów. Wartość pozycji to iloczyn liczby sztuk i ceny jednostkowej netto: radar FMCW mmWave 77 GHz, SPI, point cloud, 4 szt. x 600 zł = 2 400 zł. Liczba sztuk odpowiada montażowi 1 radaru na naczepę w 3 pojazdach oraz egzemplarzowi rezerwowemu. Każdy komplet lub składnik zostanie ujęty w ewidencji jako odrębny środek trwały o wartości początkowej 600 zł netto, kompletny i zdatny do użytku. Wartość początkowa nie przekracza 10 000 zł, więc zgodnie z ustawą o rachunkowości i polityką rachunkowości Everest11 odpis nastąpi jednorazowo w miesiącu oddania do używania (stawka roczna 100%, okres amortyzacji 1 miesiąc, odpis miesięczny równy wartości początkowej). Środek będzie wykorzystywany w projekcie przez 21 miesięcy (M10-M30) wyłącznie do prac B+R, po M30 zostanie zlikwidowany protokołem likwidacji, a zakup nie jest współfinansowany z innych środków. Wydatek obejmuje zakup środka trwałego i jego odpis, a kwota kwalifikowalna to wartość początkowa netto.</w:t>
+        <w:t>Rozeznanie rynku objęło trzech dostawców modułów radarowych FMCW mmWave: Mouser (karta Texas Instruments IWR6843AOPEVM, 257,49 USD), Digi-Key i sklep Texas Instruments (dostęp 01.10.2026). Wartość pozycji to iloczyn liczby sztuk i ceny jednostkowej netto: radar FMCW mmWave 77 GHz, SPI, point cloud, 4 szt. x 600 zł = 2 400 zł. Liczba sztuk odpowiada montażowi 1 radaru na naczepę w 3 pojazdach oraz egzemplarzowi rezerwowemu. Każdy komplet lub składnik jest odrębnym środkiem trwałym o wartości początkowej 600 zł netto, więc zgodnie z ustawą o rachunkowości i polityką rachunkowości Everest11 zostanie odpisany jednorazowo w miesiącu oddania do używania (stawka roczna 100%, okres amortyzacji 1 miesiąc, odpis równy wartości początkowej). Środek będzie używany w projekcie wyłącznie do prac B+R przez 30 miesięcy (M1-M30), po M30 zostanie zlikwidowany protokołem likwidacji, a zakup nie jest współfinansowany z innych środków. Kwota kwalifikowalna to wartość początkowa netto, a różnicę do ceny zakupu pokryje Everest11.</w:t>
       </w:r>
     </w:p>
     <w:p>
@@ -3027,7 +3027,7 @@
           <w:color w:val="666666"/>
           <w:sz w:val="17"/>
         </w:rPr>
-        <w:t xml:space="preserve"> [1359 znaków]</w:t>
+        <w:t xml:space="preserve"> [1243 znaków]</w:t>
       </w:r>
     </w:p>
     <w:p>
@@ -3038,7 +3038,7 @@
         <w:rPr>
           <w:b w:val="0"/>
         </w:rPr>
-        <w:t>Koszt oszacowano na podstawie cenników dystrybutorów elementów elektronicznych (Digi-Key, np. czujniki Bosch Sensortec i Sensirion SHT40, dostęp 2026). Wartość pozycji to iloczyn liczby sztuk i ceny jednostkowej netto: czujnik IMU 1 kHz, 4 szt. x 800 zł = 3 200 zł; czujnik temperatury i wilgotności multi-point, 4 szt. x 300 zł = 1 200 zł; czujnik akustyczny (mikrofon MEMS), 1 szt. x 500 zł = 500 zł. Razem 4 900 zł netto. Liczba sztuk odpowiada 1 kompletowi IMU i czujników środowiskowych na naczepę w 3 pojazdach oraz kompletowi rezerwowemu, a mikrofon jest pilotażowy. Każdy komplet lub składnik zostanie ujęty w ewidencji jako odrębny środek trwały o wartości początkowej 1 100 zł (komplet IMU i czujników środowiskowych) oraz 500 zł (mikrofon) netto, kompletny i zdatny do użytku. Wartość początkowa nie przekracza 10 000 zł, więc zgodnie z ustawą o rachunkowości i polityką rachunkowości Everest11 odpis nastąpi jednorazowo w miesiącu oddania do używania (stawka roczna 100%, okres amortyzacji 1 miesiąc, odpis miesięczny równy wartości początkowej). Środek będzie wykorzystywany w projekcie przez 21 miesięcy (M10-M30) wyłącznie do prac B+R, po M30 zostanie zlikwidowany protokołem likwidacji, a zakup nie jest współfinansowany z innych środków. Wydatek obejmuje zakup środka trwałego i jego odpis, a kwota kwalifikowalna to wartość początkowa netto.</w:t>
+        <w:t>Rozeznanie rynku objęło trzech dostawców: Digi-Key, Mouser i Farnell (czujniki Bosch Sensortec i Sensirion, np. SHT40 od ok. 7,80 EUR w Farnell) (dostęp 2026). Wartość pozycji to iloczyn liczby sztuk i ceny jednostkowej netto: czujnik IMU 1 kHz, 4 szt. x 800 zł = 3 200 zł; czujnik temperatury i wilgotności multi-point, 4 szt. x 300 zł = 1 200 zł; czujnik akustyczny (mikrofon MEMS), 1 szt. x 500 zł = 500 zł. Razem 4 900 zł netto. Liczba sztuk odpowiada 1 kompletowi IMU i czujników środowiskowych na naczepę w 3 pojazdach oraz kompletowi rezerwowemu, a mikrofon jest pilotażowy. Każdy komplet lub składnik jest odrębnym środkiem trwałym o wartości początkowej 1 100 zł (komplet IMU i czujników środowiskowych) oraz 500 zł (mikrofon) netto, więc zgodnie z ustawą o rachunkowości i polityką rachunkowości Everest11 zostanie odpisany jednorazowo w miesiącu oddania do używania (stawka roczna 100%, okres amortyzacji 1 miesiąc, odpis równy wartości początkowej). Środek będzie używany w projekcie wyłącznie do prac B+R przez 30 miesięcy (M1-M30), po M30 zostanie zlikwidowany protokołem likwidacji, a zakup nie jest współfinansowany z innych środków. Kwota kwalifikowalna to wartość początkowa netto, a różnicę do ceny zakupu pokryje Everest11.</w:t>
       </w:r>
     </w:p>
     <w:p>
@@ -3117,7 +3117,7 @@
           <w:color w:val="666666"/>
           <w:sz w:val="17"/>
         </w:rPr>
-        <w:t xml:space="preserve"> [1496 znaków]</w:t>
+        <w:t xml:space="preserve"> [1315 znaków]</w:t>
       </w:r>
     </w:p>
     <w:p>
@@ -3128,7 +3128,7 @@
         <w:rPr>
           <w:b w:val="0"/>
         </w:rPr>
-        <w:t>Koszt oszacowano na podstawie cen w sklepach i u dystrybutorów (dostęp 01.10.2026): jednostka embedded AI klasy NVIDIA Jetson Orin Nano 8 GB (40 TOPS) kosztuje ok. 1 400 zł (elecena.pl), a moduł w cenniku producenta 1KU+ 399 USD, czyli ok. 1 520 zł po kursie NBP 3,803 z 17.09.2026; dysk NVMe 1 TB Kingston NV3 kosztuje od 429 zł do 629 zł brutto, czyli od 349 do 511 zł netto (Morele, x-kom); router Teltonika RUT956 z GNSS kosztuje od 1 174 do 1 333 zł netto (dystrybutorzy). Wartość pozycji to iloczyn liczby sztuk i ceny jednostkowej netto: jednostka embedded AI, 4 szt. x 1 400 zł = 5 600 zł; dysk NVMe 1 TB, 4 szt. x 400 zł = 1 600 zł; router LTE/5G z GNSS i antenami, 4 szt. x 1 200 zł = 4 800 zł. Razem 12 000 zł netto. Przyjęto ceny ze środka przedziałów rynkowych. Każdy komplet lub składnik zostanie ujęty w ewidencji jako odrębny środek trwały o wartości początkowej 3 000 zł netto, kompletny i zdatny do użytku. Wartość początkowa nie przekracza 10 000 zł, więc zgodnie z ustawą o rachunkowości i polityką rachunkowości Everest11 odpis nastąpi jednorazowo w miesiącu oddania do używania (stawka roczna 100%, okres amortyzacji 1 miesiąc, odpis miesięczny równy wartości początkowej). Środek będzie wykorzystywany w projekcie przez 21 miesięcy (M10-M30) wyłącznie do prac B+R, po M30 zostanie zlikwidowany protokołem likwidacji, a zakup nie jest współfinansowany z innych środków. Wydatek obejmuje zakup środka trwałego i jego odpis, a kwota kwalifikowalna to wartość początkowa netto.</w:t>
+        <w:t>Rozeznanie rynku (dostęp 01.10.2026) objęło: dla jednostki AI reichelt elektronik (moduł Jetson Orin Nano 8 GB, 1 396,51 zł), NVIDIA (399 USD przy 1KU+, ok. 1 520 zł) i Botland (zestawy z płytą nośną od ok. 2 800 zł); dla dysku NVMe 1 TB x-kom (629 zł brutto), Morele (429 zł brutto) i Computer Orbit (od 164 USD); dla routera RUT956 mysky-shop (od 1 444 zł brutto), RS Components i ofertę niemiecką (239,90 EUR brutto). Wartość pozycji to iloczyn liczby sztuk i ceny jednostkowej netto: jednostka embedded AI, 4 szt. x 1 400 zł = 5 600 zł; dysk NVMe 1 TB, 4 szt. x 400 zł = 1 600 zł; router LTE/5G z GNSS i antenami, 4 szt. x 1 200 zł = 4 800 zł. Razem 12 000 zł netto. Przyjęto ceny ze środka przedziałów rynkowych. Każdy komplet lub składnik jest odrębnym środkiem trwałym o wartości początkowej 3 000 zł netto, więc zgodnie z ustawą o rachunkowości i polityką rachunkowości Everest11 zostanie odpisany jednorazowo w miesiącu oddania do używania (stawka roczna 100%, okres amortyzacji 1 miesiąc, odpis równy wartości początkowej). Środek będzie używany w projekcie wyłącznie do prac B+R przez 30 miesięcy (M1-M30), po M30 zostanie zlikwidowany protokołem likwidacji, a zakup nie jest współfinansowany z innych środków. Kwota kwalifikowalna to wartość początkowa netto, a różnicę do ceny zakupu pokryje Everest11.</w:t>
       </w:r>
     </w:p>
     <w:p>
@@ -3207,7 +3207,7 @@
           <w:color w:val="666666"/>
           <w:sz w:val="17"/>
         </w:rPr>
-        <w:t xml:space="preserve"> [1308 znaków]</w:t>
+        <w:t xml:space="preserve"> [1283 znaków]</w:t>
       </w:r>
     </w:p>
     <w:p>
@@ -3218,7 +3218,7 @@
         <w:rPr>
           <w:b w:val="0"/>
         </w:rPr>
-        <w:t>Koszt oszacowano na podstawie cenników dystrybutorów (TME, RS Components, dostęp 2026), np. obudowa przemysłowa 260 x 160 x 90 mm kosztuje 411,59 zł netto (RS). Wartość pozycji to iloczyn liczby sztuk i ceny jednostkowej netto: zasilanie 12/24 V DC-DC z UPS supercap, 4 szt. x 500 zł = 2 000 zł; obudowa IP67 z przewodami, złączami M12 i peszlami, 4 szt. x 2 000 zł = 8 000 zł; panel HMI z buzzerem 100 dB, 4 szt. x 500 zł = 2 000 zł; switch ethernetowy 10-port RJ45, 4 szt. x 100 zł = 400 zł; switch przemysłowy PoE+ 10-port 1 Gbps, 4 szt. x 1 000 zł = 4 000 zł. Razem 16 400 zł netto. Każdy komplet lub składnik zostanie ujęty w ewidencji jako odrębny środek trwały o wartości początkowej 4 100 zł netto, kompletny i zdatny do użytku. Wartość początkowa nie przekracza 10 000 zł, więc zgodnie z ustawą o rachunkowości i polityką rachunkowości Everest11 odpis nastąpi jednorazowo w miesiącu oddania do używania (stawka roczna 100%, okres amortyzacji 1 miesiąc, odpis miesięczny równy wartości początkowej). Środek będzie wykorzystywany w projekcie przez 21 miesięcy (M10-M30) wyłącznie do prac B+R, po M30 zostanie zlikwidowany protokołem likwidacji, a zakup nie jest współfinansowany z innych środków. Wydatek obejmuje zakup środka trwałego i jego odpis, a kwota kwalifikowalna to wartość początkowa netto.</w:t>
+        <w:t>Rozeznanie rynku objęło trzech dostawców: TME (obudowy Gainta IP67 od ok. 18 USD), RS Components (obudowy RS PRO IP67, w tym 260 x 160 x 90 mm za 411,59 zł) i Farnell, a przetwornice DC-DC w cennikach RS Components (np. 144,09 zł za 10 W) i TME (dostęp 2026). Wartość pozycji to iloczyn liczby sztuk i ceny jednostkowej netto: zasilanie 12/24 V DC-DC z UPS supercap, 4 szt. x 500 zł = 2 000 zł; obudowa IP67 z przewodami, złączami M12 i peszlami, 4 szt. x 2 000 zł = 8 000 zł; panel HMI z buzzerem 100 dB, 4 szt. x 500 zł = 2 000 zł; switch ethernetowy 10-port RJ45, 4 szt. x 100 zł = 400 zł; switch przemysłowy PoE+ 10-port 1 Gbps, 4 szt. x 1 000 zł = 4 000 zł. Razem 16 400 zł netto. Każdy komplet lub składnik jest odrębnym środkiem trwałym o wartości początkowej 4 100 zł netto, więc zgodnie z ustawą o rachunkowości i polityką rachunkowości Everest11 zostanie odpisany jednorazowo w miesiącu oddania do używania (stawka roczna 100%, okres amortyzacji 1 miesiąc, odpis równy wartości początkowej). Środek będzie używany w projekcie wyłącznie do prac B+R przez 30 miesięcy (M1-M30), po M30 zostanie zlikwidowany protokołem likwidacji, a zakup nie jest współfinansowany z innych środków. Kwota kwalifikowalna to wartość początkowa netto, a różnicę do ceny zakupu pokryje Everest11.</w:t>
       </w:r>
     </w:p>
     <w:p>
@@ -3297,7 +3297,7 @@
           <w:color w:val="666666"/>
           <w:sz w:val="17"/>
         </w:rPr>
-        <w:t xml:space="preserve"> [1269 znaków]</w:t>
+        <w:t xml:space="preserve"> [1208 znaków]</w:t>
       </w:r>
     </w:p>
     <w:p>
@@ -3308,7 +3308,7 @@
         <w:rPr>
           <w:b w:val="0"/>
         </w:rPr>
-        <w:t>Koszt oszacowano na podstawie cenników dystrybutorów komponentów optycznych i laserowych (Edmund Optics, dostęp 2026). Wartość pozycji to iloczyn liczby sztuk i ceny jednostkowej netto: moduł laserowy (projektor linii), 4 szt. x 400 zł = 1 600 zł; soczewki Powell, cylindryczne lub DOE, 5 szt. x 200 zł = 1 000 zł; sterowniki laserów, 4 szt. x 300 zł = 1 200 zł. Razem 3 800 zł netto. Liczba sztuk odpowiada 4 kompletom (laser, soczewka, sterownik) oraz jednej soczewce zapasowej. Każdy komplet lub składnik zostanie ujęty w ewidencji jako odrębny środek trwały o wartości początkowej 900 zł (komplet laser, soczewka, sterownik) oraz 200 zł (soczewka zapasowa) netto, kompletny i zdatny do użytku. Wartość początkowa nie przekracza 10 000 zł, więc zgodnie z ustawą o rachunkowości i polityką rachunkowości Everest11 odpis nastąpi jednorazowo w miesiącu oddania do używania (stawka roczna 100%, okres amortyzacji 1 miesiąc, odpis miesięczny równy wartości początkowej). Środek będzie wykorzystywany w projekcie przez 21 miesięcy (M10-M30) wyłącznie do prac B+R, po M30 zostanie zlikwidowany protokołem likwidacji, a zakup nie jest współfinansowany z innych środków. Wydatek obejmuje zakup środka trwałego i jego odpis, a kwota kwalifikowalna to wartość początkowa netto.</w:t>
+        <w:t>Rozeznanie rynku objęło trzech dostawców: Picotronic (moduł laserowy linii 650 nm od 16,71 EUR, wersje z soczewką Powell do ponad 1 000 EUR), Edmund Optics i Thorlabs (dostęp 2026). Wartość pozycji to iloczyn liczby sztuk i ceny jednostkowej netto: moduł laserowy (projektor linii), 4 szt. x 400 zł = 1 600 zł; soczewki Powell, cylindryczne lub DOE, 5 szt. x 200 zł = 1 000 zł; sterowniki laserów, 4 szt. x 300 zł = 1 200 zł. Razem 3 800 zł netto. Liczba sztuk odpowiada 4 kompletom (laser, soczewka, sterownik) oraz jednej soczewce zapasowej. Każdy komplet lub składnik jest odrębnym środkiem trwałym o wartości początkowej 900 zł (komplet laser, soczewka, sterownik) oraz 200 zł (soczewka zapasowa) netto, więc zgodnie z ustawą o rachunkowości i polityką rachunkowości Everest11 zostanie odpisany jednorazowo w miesiącu oddania do używania (stawka roczna 100%, okres amortyzacji 1 miesiąc, odpis równy wartości początkowej). Środek będzie używany w projekcie wyłącznie do prac B+R przez 30 miesięcy (M1-M30), po M30 zostanie zlikwidowany protokołem likwidacji, a zakup nie jest współfinansowany z innych środków. Kwota kwalifikowalna to wartość początkowa netto, a różnicę do ceny zakupu pokryje Everest11.</w:t>
       </w:r>
     </w:p>
     <w:p>
@@ -3387,7 +3387,7 @@
           <w:color w:val="666666"/>
           <w:sz w:val="17"/>
         </w:rPr>
-        <w:t xml:space="preserve"> [1332 znaków]</w:t>
+        <w:t xml:space="preserve"> [1334 znaków]</w:t>
       </w:r>
     </w:p>
     <w:p>
@@ -3398,7 +3398,7 @@
         <w:rPr>
           <w:b w:val="0"/>
         </w:rPr>
-        <w:t>Koszt oszacowano na podstawie ogólnodostępnych cenników producentów sprzętu wizyjnego (Basler, Edmund Optics, dostęp 2026). Wartość pozycji to iloczyn liczby sztuk i ceny jednostkowej netto: kamera EO typ 1, 4 szt. x 1 500 zł = 6 000 zł; kamera EO typ 2, 3 szt. x 4 500 zł = 13 500 zł; obiektyw C-mount typ 1, 4 szt. x 300 zł = 1 200 zł; obiektyw C-mount typ 2, 3 szt. x 2 000 zł = 6 000 zł; oświetlacz LED typ 1, 4 szt. x 125 zł = 500 zł; oświetlacz LED typ 2, 3 szt. x 1 000 zł = 3 000 zł. Razem 30 200 zł netto. Cena typu 2 mieści się w przedziale rynkowym kamer przemysłowych tej klasy. Każdy komplet lub składnik zostanie ujęty w ewidencji jako odrębny środek trwały o wartości początkowej 1 925 zł (typ 1) i 7 500 zł (typ 2) netto, kompletny i zdatny do użytku. Wartość początkowa nie przekracza 10 000 zł, więc zgodnie z ustawą o rachunkowości i polityką rachunkowości PRz odpis nastąpi jednorazowo w miesiącu oddania do używania (stawka roczna 100%, okres amortyzacji 1 miesiąc, odpis miesięczny równy wartości początkowej). Środek będzie wykorzystywany w projekcie przez 29 miesięcy (M2-M30) wyłącznie do prac B+R, po M30 zostanie zlikwidowany protokołem likwidacji, a zakup nie jest współfinansowany z innych środków. Wydatek obejmuje zakup środka trwałego i jego odpis, a kwota kwalifikowalna to wartość początkowa netto.</w:t>
+        <w:t>Rozeznanie rynku objęło trzech dostawców kamer: Basler (a2A1920-51gm, 319 EUR netto), Edmund Optics (494 EUR w wersji Pro) i Machine Vision Store (359 USD), a obiektywy i oświetlacze porównano w cennikach Basler, Kowa i Edmund Optics (dostęp 01.10.2026). Wartość pozycji to iloczyn liczby sztuk i ceny jednostkowej netto: kamera EO typ 1, 4 szt. x 1 500 zł = 6 000 zł; kamera EO typ 2, 3 szt. x 4 500 zł = 13 500 zł; obiektyw C-mount typ 1, 4 szt. x 300 zł = 1 200 zł; obiektyw C-mount typ 2, 3 szt. x 2 000 zł = 6 000 zł; oświetlacz LED typ 1, 4 szt. x 125 zł = 500 zł; oświetlacz LED typ 2, 3 szt. x 1 000 zł = 3 000 zł. Razem 30 200 zł netto. Cena typu 2 mieści się w przedziale rynkowym kamer przemysłowych tej klasy. Każdy komplet lub składnik jest odrębnym środkiem trwałym o wartości początkowej 1 925 zł (typ 1) i 7 500 zł (typ 2) netto, więc zgodnie z ustawą o rachunkowości i polityką rachunkowości PRz zostanie odpisany jednorazowo w miesiącu oddania do używania (stawka roczna 100%, okres amortyzacji 1 miesiąc, odpis równy wartości początkowej). Środek będzie używany w projekcie wyłącznie do prac B+R przez 30 miesięcy (M1-M30), po M30 zostanie zlikwidowany protokołem likwidacji, a zakup nie jest współfinansowany z innych środków. Kwota kwalifikowalna to wartość początkowa netto, a różnicę do ceny zakupu pokryje PRz.</w:t>
       </w:r>
     </w:p>
     <w:p>
@@ -3477,7 +3477,7 @@
           <w:color w:val="666666"/>
           <w:sz w:val="17"/>
         </w:rPr>
-        <w:t xml:space="preserve"> [1466 znaków]</w:t>
+        <w:t xml:space="preserve"> [1423 znaków]</w:t>
       </w:r>
     </w:p>
     <w:p>
@@ -3488,7 +3488,7 @@
         <w:rPr>
           <w:b w:val="0"/>
         </w:rPr>
-        <w:t>Koszt oszacowano na podstawie ogólnodostępnych cenników producentów (Luxonis, Orbbec, Basler, Lucid, dostęp 01.10.2026): kamera ToF Basler blaze kosztuje 1 579 EUR netto, czyli ok. 6 900 zł po kursie NBP 4,3632 z 17.09.2026, a Lucid Helios2 1 645 EUR. Wartość pozycji to iloczyn liczby sztuk i ceny jednostkowej netto: kamera głębi typ 1, 4 szt. x 2 000 zł = 8 000 zł; akcesoria typ 1, 4 szt. x 500 zł = 2 000 zł; zestaw kamery ToF typ 2 (kamera ok. 6 900 zł z zasilaniem PoE, uchwytem i kablami), 3 szt. x 10 000 zł = 30 000 zł; akcesoria typ 2 (osłona, statyw, tarcza kalibracyjna), 3 szt. x 2 500 zł = 7 500 zł. Razem 47 500 zł netto. Akcesoria typu 2 są odrębne i nie dublują zestawu. Każdy komplet lub składnik zostanie ujęty w ewidencji jako odrębny środek trwały o wartości początkowej 2 500 zł (typ 1), 10 000 zł (zestaw typ 2) i 2 500 zł (akcesoria typ 2) netto, kompletny i zdatny do użytku. Wartość początkowa nie przekracza 10 000 zł, więc zgodnie z ustawą o rachunkowości i polityką rachunkowości PRz odpis nastąpi jednorazowo w miesiącu oddania do używania (stawka roczna 100%, okres amortyzacji 1 miesiąc, odpis miesięczny równy wartości początkowej). Środek będzie wykorzystywany w projekcie przez 29 miesięcy (M2-M30) wyłącznie do prac B+R, po M30 zostanie zlikwidowany protokołem likwidacji, a zakup nie jest współfinansowany z innych środków. Wydatek obejmuje zakup środka trwałego i jego odpis, a kwota kwalifikowalna to wartość początkowa netto.</w:t>
+        <w:t>Rozeznanie rynku objęło trzech dostawców kamer głębi: Basler (blaze, 1 579 EUR netto), Edmund Optics (Lucid Helios2, 1 645 EUR) i RobotShop (Orbbec Femto Bolt, 559 USD), a klasę podstawową porównano z ofertą Luxonis (dostęp 01.10.2026). Po kursach NBP z 17.09.2026 (4,3632 PLN/EUR, 3,803 PLN/USD) kamera ToF Basler kosztuje ok. 6 900 zł. Wartość pozycji to iloczyn liczby sztuk i ceny jednostkowej netto: kamera głębi typ 1, 4 szt. x 2 000 zł = 8 000 zł; akcesoria typ 1, 4 szt. x 500 zł = 2 000 zł; zestaw kamery ToF typ 2 (kamera ok. 6 900 zł z zasilaniem PoE, uchwytem i kablami), 3 szt. x 10 000 zł = 30 000 zł; akcesoria typ 2 (osłona, statyw, tarcza kalibracyjna), 3 szt. x 2 500 zł = 7 500 zł. Razem 47 500 zł netto. Akcesoria typu 2 są odrębne i nie dublują zestawu. Każdy komplet lub składnik jest odrębnym środkiem trwałym o wartości początkowej 2 500 zł (typ 1), 10 000 zł (zestaw typ 2) i 2 500 zł (akcesoria typ 2) netto, więc zgodnie z ustawą o rachunkowości i polityką rachunkowości PRz zostanie odpisany jednorazowo w miesiącu oddania do używania (stawka roczna 100%, okres amortyzacji 1 miesiąc, odpis równy wartości początkowej). Środek będzie używany w projekcie wyłącznie do prac B+R przez 30 miesięcy (M1-M30), po M30 zostanie zlikwidowany protokołem likwidacji, a zakup nie jest współfinansowany z innych środków. Kwota kwalifikowalna to wartość początkowa netto, a różnicę do ceny zakupu pokryje PRz.</w:t>
       </w:r>
     </w:p>
     <w:p>
@@ -3567,7 +3567,7 @@
           <w:color w:val="666666"/>
           <w:sz w:val="17"/>
         </w:rPr>
-        <w:t xml:space="preserve"> [1036 znaków]</w:t>
+        <w:t xml:space="preserve"> [967 znaków]</w:t>
       </w:r>
     </w:p>
     <w:p>
@@ -3578,7 +3578,7 @@
         <w:rPr>
           <w:b w:val="0"/>
         </w:rPr>
-        <w:t>Koszt oszacowano na podstawie cenników dystrybutorów elektroniki (Digi-Key, Mouser, dostęp 2026). Wartość pozycji to iloczyn liczby sztuk i ceny jednostkowej netto: radar FMCW mmWave typ 1, 3 szt. x 600 zł = 1 800 zł; radar FMCW mmWave typ 2, 3 szt. x 3 500 zł = 10 500 zł. Razem 12 300 zł netto. Każdy komplet lub składnik zostanie ujęty w ewidencji jako odrębny środek trwały o wartości początkowej 600 zł (typ 1) i 3 500 zł (typ 2) netto, kompletny i zdatny do użytku. Wartość początkowa nie przekracza 10 000 zł, więc zgodnie z ustawą o rachunkowości i polityką rachunkowości PRz odpis nastąpi jednorazowo w miesiącu oddania do używania (stawka roczna 100%, okres amortyzacji 1 miesiąc, odpis miesięczny równy wartości początkowej). Środek będzie wykorzystywany w projekcie przez 29 miesięcy (M2-M30) wyłącznie do prac B+R, po M30 zostanie zlikwidowany protokołem likwidacji, a zakup nie jest współfinansowany z innych środków. Wydatek obejmuje zakup środka trwałego i jego odpis, a kwota kwalifikowalna to wartość początkowa netto.</w:t>
+        <w:t>Rozeznanie rynku objęło trzech dostawców: Mouser (karta Texas Instruments IWR6843AOPEVM, 257,49 USD), Digi-Key i sklep Texas Instruments (dostęp 01.10.2026). Wartość pozycji to iloczyn liczby sztuk i ceny jednostkowej netto: radar FMCW mmWave typ 1, 3 szt. x 600 zł = 1 800 zł; radar FMCW mmWave typ 2, 3 szt. x 3 500 zł = 10 500 zł. Razem 12 300 zł netto. Każdy komplet lub składnik jest odrębnym środkiem trwałym o wartości początkowej 600 zł (typ 1) i 3 500 zł (typ 2) netto, więc zgodnie z ustawą o rachunkowości i polityką rachunkowości PRz zostanie odpisany jednorazowo w miesiącu oddania do używania (stawka roczna 100%, okres amortyzacji 1 miesiąc, odpis równy wartości początkowej). Środek będzie używany w projekcie wyłącznie do prac B+R przez 30 miesięcy (M1-M30), po M30 zostanie zlikwidowany protokołem likwidacji, a zakup nie jest współfinansowany z innych środków. Kwota kwalifikowalna to wartość początkowa netto, a różnicę do ceny zakupu pokryje PRz.</w:t>
       </w:r>
     </w:p>
     <w:p>
@@ -3657,7 +3657,7 @@
           <w:color w:val="666666"/>
           <w:sz w:val="17"/>
         </w:rPr>
-        <w:t xml:space="preserve"> [1159 znaków]</w:t>
+        <w:t xml:space="preserve"> [1068 znaków]</w:t>
       </w:r>
     </w:p>
     <w:p>
@@ -3668,7 +3668,7 @@
         <w:rPr>
           <w:b w:val="0"/>
         </w:rPr>
-        <w:t>Koszt oszacowano na podstawie zestawień ofert specjalistycznego sprzętu optycznego (Edmund Optics, Thorlabs, dostęp 2026). Wartość pozycji to iloczyn liczby sztuk i ceny jednostkowej netto: laser (projektor linii), 4 szt. x 500 zł = 2 000 zł; soczewki kształtujące, 5 szt. x 300 zł = 1 500 zł; sterowniki laserów, 5 szt. x 480 zł = 2 400 zł. Razem 5 900 zł netto. Każdy komplet lub składnik zostanie ujęty w ewidencji jako odrębny środek trwały o wartości początkowej 1 280 zł (komplet laser, soczewka, sterownik) oraz 780 zł (zapasowa soczewka i sterownik) netto, kompletny i zdatny do użytku. Wartość początkowa nie przekracza 10 000 zł, więc zgodnie z ustawą o rachunkowości i polityką rachunkowości PRz odpis nastąpi jednorazowo w miesiącu oddania do używania (stawka roczna 100%, okres amortyzacji 1 miesiąc, odpis miesięczny równy wartości początkowej). Środek będzie wykorzystywany w projekcie przez 29 miesięcy (M2-M30) wyłącznie do prac B+R, po M30 zostanie zlikwidowany protokołem likwidacji, a zakup nie jest współfinansowany z innych środków. Wydatek obejmuje zakup środka trwałego i jego odpis, a kwota kwalifikowalna to wartość początkowa netto.</w:t>
+        <w:t>Rozeznanie rynku objęło trzech dostawców: Edmund Optics, Thorlabs i Picotronic (moduły laserowe linii od 16,71 EUR, soczewki Powell i sterowniki) (dostęp 2026). Wartość pozycji to iloczyn liczby sztuk i ceny jednostkowej netto: laser (projektor linii), 4 szt. x 500 zł = 2 000 zł; soczewki kształtujące, 5 szt. x 300 zł = 1 500 zł; sterowniki laserów, 5 szt. x 480 zł = 2 400 zł. Razem 5 900 zł netto. Każdy komplet lub składnik jest odrębnym środkiem trwałym o wartości początkowej 1 280 zł (komplet laser, soczewka, sterownik) oraz 780 zł (zapasowa soczewka i sterownik) netto, więc zgodnie z ustawą o rachunkowości i polityką rachunkowości PRz zostanie odpisany jednorazowo w miesiącu oddania do używania (stawka roczna 100%, okres amortyzacji 1 miesiąc, odpis równy wartości początkowej). Środek będzie używany w projekcie wyłącznie do prac B+R przez 30 miesięcy (M1-M30), po M30 zostanie zlikwidowany protokołem likwidacji, a zakup nie jest współfinansowany z innych środków. Kwota kwalifikowalna to wartość początkowa netto, a różnicę do ceny zakupu pokryje PRz.</w:t>
       </w:r>
     </w:p>
     <w:p>
@@ -3747,7 +3747,7 @@
           <w:color w:val="666666"/>
           <w:sz w:val="17"/>
         </w:rPr>
-        <w:t xml:space="preserve"> [1148 znaków]</w:t>
+        <w:t xml:space="preserve"> [1067 znaków]</w:t>
       </w:r>
     </w:p>
     <w:p>
@@ -3758,7 +3758,7 @@
         <w:rPr>
           <w:b w:val="0"/>
         </w:rPr>
-        <w:t>Koszt oszacowano na podstawie cenników dystrybutorów elementów elektronicznych (Digi-Key, Mouser, dostęp 2026). Wartość pozycji to iloczyn liczby sztuk i ceny jednostkowej netto: czujnik IMU, 4 szt. x 800 zł = 3 200 zł; czujnik temperatury i wilgotności typ 1, 1 szt. x 300 zł = 300 zł; czujnik temperatury i wilgotności typ 2 referencyjny, 1 szt. x 800 zł = 800 zł. Razem 4 300 zł netto. Każdy komplet lub składnik zostanie ujęty w ewidencji jako odrębny środek trwały o wartości początkowej 800 zł (IMU), 300 zł i 800 zł (czujniki środowiskowe) netto, kompletny i zdatny do użytku. Wartość początkowa nie przekracza 10 000 zł, więc zgodnie z ustawą o rachunkowości i polityką rachunkowości PRz odpis nastąpi jednorazowo w miesiącu oddania do używania (stawka roczna 100%, okres amortyzacji 1 miesiąc, odpis miesięczny równy wartości początkowej). Środek będzie wykorzystywany w projekcie przez 25 miesięcy (M6-M30) wyłącznie do prac B+R, po M30 zostanie zlikwidowany protokołem likwidacji, a zakup nie jest współfinansowany z innych środków. Wydatek obejmuje zakup środka trwałego i jego odpis, a kwota kwalifikowalna to wartość początkowa netto.</w:t>
+        <w:t>Rozeznanie rynku objęło trzech dostawców: Digi-Key, Mouser i Farnell (czujniki Bosch Sensortec i Sensirion, np. SHT40 od ok. 7,80 EUR w Farnell) (dostęp 2026). Wartość pozycji to iloczyn liczby sztuk i ceny jednostkowej netto: czujnik IMU, 4 szt. x 800 zł = 3 200 zł; czujnik temperatury i wilgotności typ 1, 1 szt. x 300 zł = 300 zł; czujnik temperatury i wilgotności typ 2 referencyjny, 1 szt. x 800 zł = 800 zł. Razem 4 300 zł netto. Każdy komplet lub składnik jest odrębnym środkiem trwałym o wartości początkowej 800 zł (IMU), 300 zł i 800 zł (czujniki środowiskowe) netto, więc zgodnie z ustawą o rachunkowości i polityką rachunkowości PRz zostanie odpisany jednorazowo w miesiącu oddania do używania (stawka roczna 100%, okres amortyzacji 1 miesiąc, odpis równy wartości początkowej). Środek będzie używany w projekcie wyłącznie do prac B+R przez 25 miesięcy (M6-M30), po M30 zostanie zlikwidowany protokołem likwidacji, a zakup nie jest współfinansowany z innych środków. Kwota kwalifikowalna to wartość początkowa netto, a różnicę do ceny zakupu pokryje PRz.</w:t>
       </w:r>
     </w:p>
     <w:p>
@@ -3837,7 +3837,7 @@
           <w:color w:val="666666"/>
           <w:sz w:val="17"/>
         </w:rPr>
-        <w:t xml:space="preserve"> [1311 znaków]</w:t>
+        <w:t xml:space="preserve"> [1365 znaków]</w:t>
       </w:r>
     </w:p>
     <w:p>
@@ -3848,7 +3848,7 @@
         <w:rPr>
           <w:b w:val="0"/>
         </w:rPr>
-        <w:t>Koszt oszacowano na podstawie cen układów SoC i nośników u producentów i dystrybutorów (NVIDIA, Teltonika, Botland, dostęp 2026). Wartość pozycji to iloczyn liczby sztuk i ceny jednostkowej netto: jednostka edge AI, 1 szt. x 7 000 zł = 7 000 zł; minikomputer do przetwarzania obrazu, 4 szt. x 1 000 zł = 4 000 zł; dysk NVMe typ 1, 1 szt. x 1 000 zł = 1 000 zł; dysk NVMe typ 2 o podwyższonej trwałości, 1 szt. x 2 500 zł = 2 500 zł; router LTE/5G z GNSS, 1 szt. x 1 500 zł = 1 500 zł. Razem 16 000 zł netto. Każdy komplet lub składnik zostanie ujęty w ewidencji jako odrębny środek trwały o wartości początkowej 7 000 zł (jednostka), 1 000 zł (minikomputer), 1 000 zł i 2 500 zł (dyski) oraz 1 500 zł (router) netto, kompletny i zdatny do użytku. Wartość początkowa nie przekracza 10 000 zł, więc zgodnie z ustawą o rachunkowości i polityką rachunkowości PRz odpis nastąpi jednorazowo w miesiącu oddania do używania (stawka roczna 100%, okres amortyzacji 1 miesiąc, odpis miesięczny równy wartości początkowej). Środek będzie wykorzystywany w projekcie przez 25 miesięcy (M6-M30) wyłącznie do prac B+R, po M30 zostanie zlikwidowany protokołem likwidacji, a zakup nie jest współfinansowany z innych środków. Wydatek obejmuje zakup środka trwałego i jego odpis, a kwota kwalifikowalna to wartość początkowa netto.</w:t>
+        <w:t>Rozeznanie rynku objęło trzech dostawców: reichelt elektronik (moduły NVIDIA Jetson, np. Orin Nano 8 GB za 1 396,51 zł), Botland (komputery jednopłytkowe, zestawy z płytą nośną od ok. 2 800 zł) i mysky-shop (routery Teltonika, od 1 444 zł brutto), a dyski NVMe sprawdzono w sklepach x-kom i Morele (dostęp 2026). Wartość pozycji to iloczyn liczby sztuk i ceny jednostkowej netto: jednostka edge AI, 1 szt. x 7 000 zł = 7 000 zł; minikomputer do przetwarzania obrazu, 4 szt. x 1 000 zł = 4 000 zł; dysk NVMe typ 1, 1 szt. x 1 000 zł = 1 000 zł; dysk NVMe typ 2 o podwyższonej trwałości, 1 szt. x 2 500 zł = 2 500 zł; router LTE/5G z GNSS, 1 szt. x 1 500 zł = 1 500 zł. Razem 16 000 zł netto. Każdy komplet lub składnik jest odrębnym środkiem trwałym o wartości początkowej 7 000 zł (jednostka), 1 000 zł (minikomputer), 1 000 zł i 2 500 zł (dyski) oraz 1 500 zł (router) netto, więc zgodnie z ustawą o rachunkowości i polityką rachunkowości PRz zostanie odpisany jednorazowo w miesiącu oddania do używania (stawka roczna 100%, okres amortyzacji 1 miesiąc, odpis równy wartości początkowej). Środek będzie używany w projekcie wyłącznie do prac B+R przez 25 miesięcy (M6-M30), po M30 zostanie zlikwidowany protokołem likwidacji, a zakup nie jest współfinansowany z innych środków. Kwota kwalifikowalna to wartość początkowa netto, a różnicę do ceny zakupu pokryje PRz.</w:t>
       </w:r>
     </w:p>
     <w:p>
@@ -3927,7 +3927,7 @@
           <w:color w:val="666666"/>
           <w:sz w:val="17"/>
         </w:rPr>
-        <w:t xml:space="preserve"> [1364 znaków]</w:t>
+        <w:t xml:space="preserve"> [1363 znaków]</w:t>
       </w:r>
     </w:p>
     <w:p>
@@ -3938,7 +3938,7 @@
         <w:rPr>
           <w:b w:val="0"/>
         </w:rPr>
-        <w:t>Koszt oszacowano na podstawie cenników dystrybutorów (TME, Mouser, Botland, dostęp 2026). Wartość pozycji to iloczyn liczby sztuk i ceny jednostkowej netto: układ zasilania DC-DC z UPS typ 1, 1 szt. x 500 zł = 500 zł; układ zasilania typ 2 wzmocniony, 1 szt. x 3 000 zł = 3 000 zł; uchwyty, obudowy IP67 i złącza typ 1, 2 kpl. x 5 000 zł = 10 000 zł; uchwyty i obudowy typ 2, 1 kpl. x 10 000 zł = 10 000 zł; panel HMI typ 1, 1 szt. x 500 zł = 500 zł; panel HMI typ 2, 1 szt. x 1 500 zł = 1 500 zł; switch PoE 1 Gbps typ 1, 1 szt. x 1 000 zł = 1 000 zł; switch przemysłowy PoE typ 2, 1 szt. x 5 000 zł = 5 000 zł. Razem 31 500 zł netto. Każdy komplet lub składnik zostanie ujęty w ewidencji jako odrębny środek trwały o wartości początkowej od 500 zł do 10 000 zł netto, kompletny i zdatny do użytku. Wartość początkowa nie przekracza 10 000 zł, więc zgodnie z ustawą o rachunkowości i polityką rachunkowości PRz odpis nastąpi jednorazowo w miesiącu oddania do używania (stawka roczna 100%, okres amortyzacji 1 miesiąc, odpis miesięczny równy wartości początkowej). Środek będzie wykorzystywany w projekcie przez 25 miesięcy (M6-M30) wyłącznie do prac B+R, po M30 zostanie zlikwidowany protokołem likwidacji, a zakup nie jest współfinansowany z innych środków. Wydatek obejmuje zakup środka trwałego i jego odpis, a kwota kwalifikowalna to wartość początkowa netto.</w:t>
+        <w:t>Rozeznanie rynku objęło trzech dostawców: TME (obudowy Gainta IP67 od ok. 18 USD), RS Components (obudowy RS PRO IP67) i Farnell, a zasilacze i switche PoE w cennikach tych samych dostawców oraz Botland (dostęp 2026). Wartość pozycji to iloczyn liczby sztuk i ceny jednostkowej netto: układ zasilania DC-DC z UPS typ 1, 1 szt. x 500 zł = 500 zł; układ zasilania typ 2 wzmocniony, 1 szt. x 3 000 zł = 3 000 zł; uchwyty, obudowy IP67 i złącza typ 1, 2 kpl. x 5 000 zł = 10 000 zł; uchwyty i obudowy typ 2, 1 kpl. x 10 000 zł = 10 000 zł; panel HMI typ 1, 1 szt. x 500 zł = 500 zł; panel HMI typ 2, 1 szt. x 1 500 zł = 1 500 zł; switch PoE 1 Gbps typ 1, 1 szt. x 1 000 zł = 1 000 zł; switch przemysłowy PoE typ 2, 1 szt. x 5 000 zł = 5 000 zł. Razem 31 500 zł netto. Każdy komplet lub składnik jest odrębnym środkiem trwałym o wartości początkowej od 500 zł do 10 000 zł netto, więc zgodnie z ustawą o rachunkowości i polityką rachunkowości PRz zostanie odpisany jednorazowo w miesiącu oddania do używania (stawka roczna 100%, okres amortyzacji 1 miesiąc, odpis równy wartości początkowej). Środek będzie używany w projekcie wyłącznie do prac B+R przez 25 miesięcy (M6-M30), po M30 zostanie zlikwidowany protokołem likwidacji, a zakup nie jest współfinansowany z innych środków. Kwota kwalifikowalna to wartość początkowa netto, a różnicę do ceny zakupu pokryje PRz.</w:t>
       </w:r>
     </w:p>
     <w:p>
@@ -4039,7 +4039,908 @@
         <w:pStyle w:val="Heading1"/>
       </w:pPr>
       <w:r>
-        <w:t>6. Do potwierdzenia przez dział techniczny i księgową</w:t>
+        <w:t>6. Weryfikacja cen i źródeł (min. 3 dostawców w każdej pozycji)</w:t>
+      </w:r>
+    </w:p>
+    <w:p>
+      <w:pPr>
+        <w:spacing w:after="60"/>
+      </w:pPr>
+      <w:r>
+        <w:rPr>
+          <w:b w:val="0"/>
+        </w:rPr>
+        <w:t>W metodzie szacowania każdej pozycji są teraz trzej dostawcy z nazwy. Poniżej ceny, które znalazłam 01.10.2026 (kurs NBP z 17.09.2026: 4,3632 PLN/EUR, 3,803 PLN/USD), i porównanie z kwotami we wniosku. Pozycje Everest11 wnioskuje o refundację tylko do kwoty z wniosku, a różnicę do ceny zakupu pokrywa wnioskodawca, co jest zapisane w każdej metodzie, więc zaniżenie ceny nie powoduje niekwalifikowalności, tylko koszt własny. Zawyżenie byłoby problemem (warunek h Przewodnika).</w:t>
+      </w:r>
+    </w:p>
+    <w:tbl>
+      <w:tblPr>
+        <w:tblStyle w:val="TableGrid"/>
+        <w:tblW w:type="auto" w:w="0"/>
+        <w:tblLook w:firstColumn="1" w:firstRow="1" w:lastColumn="0" w:lastRow="0" w:noHBand="0" w:noVBand="1" w:val="04A0"/>
+      </w:tblPr>
+      <w:tblGrid>
+        <w:gridCol w:w="2409"/>
+        <w:gridCol w:w="2409"/>
+        <w:gridCol w:w="2409"/>
+        <w:gridCol w:w="2409"/>
+      </w:tblGrid>
+      <w:tr>
+        <w:tc>
+          <w:tcPr>
+            <w:tcW w:type="dxa" w:w="1814"/>
+          </w:tcPr>
+          <w:p>
+            <w:r/>
+            <w:r>
+              <w:rPr>
+                <w:b/>
+                <w:sz w:val="18"/>
+              </w:rPr>
+              <w:t>Składnik</w:t>
+            </w:r>
+          </w:p>
+        </w:tc>
+        <w:tc>
+          <w:tcPr>
+            <w:tcW w:type="dxa" w:w="3515"/>
+          </w:tcPr>
+          <w:p>
+            <w:r/>
+            <w:r>
+              <w:rPr>
+                <w:b/>
+                <w:sz w:val="18"/>
+              </w:rPr>
+              <w:t>Ceny znalezione w źródłach</w:t>
+            </w:r>
+          </w:p>
+        </w:tc>
+        <w:tc>
+          <w:tcPr>
+            <w:tcW w:type="dxa" w:w="2041"/>
+          </w:tcPr>
+          <w:p>
+            <w:r/>
+            <w:r>
+              <w:rPr>
+                <w:b/>
+                <w:sz w:val="18"/>
+              </w:rPr>
+              <w:t>We wniosku</w:t>
+            </w:r>
+          </w:p>
+        </w:tc>
+        <w:tc>
+          <w:tcPr>
+            <w:tcW w:type="dxa" w:w="2381"/>
+          </w:tcPr>
+          <w:p>
+            <w:r/>
+            <w:r>
+              <w:rPr>
+                <w:b/>
+                <w:sz w:val="18"/>
+              </w:rPr>
+              <w:t>Ocena</w:t>
+            </w:r>
+          </w:p>
+        </w:tc>
+      </w:tr>
+      <w:tr>
+        <w:tc>
+          <w:tcPr>
+            <w:tcW w:type="dxa" w:w="1814"/>
+          </w:tcPr>
+          <w:p>
+            <w:r/>
+            <w:r>
+              <w:rPr>
+                <w:b w:val="0"/>
+                <w:sz w:val="18"/>
+              </w:rPr>
+              <w:t>Kamera EO Basler ace 2 a2A1920-51gm</w:t>
+            </w:r>
+          </w:p>
+        </w:tc>
+        <w:tc>
+          <w:tcPr>
+            <w:tcW w:type="dxa" w:w="3515"/>
+          </w:tcPr>
+          <w:p>
+            <w:r/>
+            <w:r>
+              <w:rPr>
+                <w:b w:val="0"/>
+                <w:sz w:val="18"/>
+              </w:rPr>
+              <w:t>Basler 319 EUR (1 392 zł); Edmund Optics 494 EUR (2 155 zł); Machine Vision Store 359 USD (1 365 zł)</w:t>
+            </w:r>
+          </w:p>
+        </w:tc>
+        <w:tc>
+          <w:tcPr>
+            <w:tcW w:type="dxa" w:w="2041"/>
+          </w:tcPr>
+          <w:p>
+            <w:r/>
+            <w:r>
+              <w:rPr>
+                <w:b w:val="0"/>
+                <w:sz w:val="18"/>
+              </w:rPr>
+              <w:t>1 500 zł</w:t>
+            </w:r>
+          </w:p>
+        </w:tc>
+        <w:tc>
+          <w:tcPr>
+            <w:tcW w:type="dxa" w:w="2381"/>
+          </w:tcPr>
+          <w:p>
+            <w:r/>
+            <w:r>
+              <w:rPr>
+                <w:b w:val="0"/>
+                <w:sz w:val="18"/>
+              </w:rPr>
+              <w:t>W przedziale.</w:t>
+            </w:r>
+          </w:p>
+        </w:tc>
+      </w:tr>
+      <w:tr>
+        <w:tc>
+          <w:tcPr>
+            <w:tcW w:type="dxa" w:w="1814"/>
+          </w:tcPr>
+          <w:p>
+            <w:r/>
+            <w:r>
+              <w:rPr>
+                <w:b w:val="0"/>
+                <w:sz w:val="18"/>
+              </w:rPr>
+              <w:t>Obiektyw C-mount 6 mm</w:t>
+            </w:r>
+          </w:p>
+        </w:tc>
+        <w:tc>
+          <w:tcPr>
+            <w:tcW w:type="dxa" w:w="3515"/>
+          </w:tcPr>
+          <w:p>
+            <w:r/>
+            <w:r>
+              <w:rPr>
+                <w:b w:val="0"/>
+                <w:sz w:val="18"/>
+              </w:rPr>
+              <w:t>Basler C125-0618-5M 168,82 EUR (737 zł); Kowa LM6JC 212 USD; Kowa LM6NCL 121 USD (460 zł)</w:t>
+            </w:r>
+          </w:p>
+        </w:tc>
+        <w:tc>
+          <w:tcPr>
+            <w:tcW w:type="dxa" w:w="2041"/>
+          </w:tcPr>
+          <w:p>
+            <w:r/>
+            <w:r>
+              <w:rPr>
+                <w:b w:val="0"/>
+                <w:sz w:val="18"/>
+              </w:rPr>
+              <w:t>300 zł (Everest11, PRz typ 1), 2 000 zł (PRz typ 2)</w:t>
+            </w:r>
+          </w:p>
+        </w:tc>
+        <w:tc>
+          <w:tcPr>
+            <w:tcW w:type="dxa" w:w="2381"/>
+          </w:tcPr>
+          <w:p>
+            <w:r/>
+            <w:r>
+              <w:rPr>
+                <w:b w:val="0"/>
+                <w:sz w:val="18"/>
+              </w:rPr>
+              <w:t>Typ 1 poniżej najtańszej oferty 460 zł. Dopłata Everest11 ok. 160 zł na sztukę lub tańszy obiektyw 2 MP.</w:t>
+            </w:r>
+          </w:p>
+        </w:tc>
+      </w:tr>
+      <w:tr>
+        <w:tc>
+          <w:tcPr>
+            <w:tcW w:type="dxa" w:w="1814"/>
+          </w:tcPr>
+          <w:p>
+            <w:r/>
+            <w:r>
+              <w:rPr>
+                <w:b w:val="0"/>
+                <w:sz w:val="18"/>
+              </w:rPr>
+              <w:t>Kamera ToF Orbbec Femto Bolt</w:t>
+            </w:r>
+          </w:p>
+        </w:tc>
+        <w:tc>
+          <w:tcPr>
+            <w:tcW w:type="dxa" w:w="3515"/>
+          </w:tcPr>
+          <w:p>
+            <w:r/>
+            <w:r>
+              <w:rPr>
+                <w:b w:val="0"/>
+                <w:sz w:val="18"/>
+              </w:rPr>
+              <w:t>RobotShop 559 USD (2 126 zł); RobotShop UK 443 GBP; Switch Science 80 080 JPY; eBay.de ok. 473 EUR</w:t>
+            </w:r>
+          </w:p>
+        </w:tc>
+        <w:tc>
+          <w:tcPr>
+            <w:tcW w:type="dxa" w:w="2041"/>
+          </w:tcPr>
+          <w:p>
+            <w:r/>
+            <w:r>
+              <w:rPr>
+                <w:b w:val="0"/>
+                <w:sz w:val="18"/>
+              </w:rPr>
+              <w:t>2 100 zł</w:t>
+            </w:r>
+          </w:p>
+        </w:tc>
+        <w:tc>
+          <w:tcPr>
+            <w:tcW w:type="dxa" w:w="2381"/>
+          </w:tcPr>
+          <w:p>
+            <w:r/>
+            <w:r>
+              <w:rPr>
+                <w:b w:val="0"/>
+                <w:sz w:val="18"/>
+              </w:rPr>
+              <w:t>W przedziale (dla EUR i USD).</w:t>
+            </w:r>
+          </w:p>
+        </w:tc>
+      </w:tr>
+      <w:tr>
+        <w:tc>
+          <w:tcPr>
+            <w:tcW w:type="dxa" w:w="1814"/>
+          </w:tcPr>
+          <w:p>
+            <w:r/>
+            <w:r>
+              <w:rPr>
+                <w:b w:val="0"/>
+                <w:sz w:val="18"/>
+              </w:rPr>
+              <w:t>Kamera ToF przemysłowa</w:t>
+            </w:r>
+          </w:p>
+        </w:tc>
+        <w:tc>
+          <w:tcPr>
+            <w:tcW w:type="dxa" w:w="3515"/>
+          </w:tcPr>
+          <w:p>
+            <w:r/>
+            <w:r>
+              <w:rPr>
+                <w:b w:val="0"/>
+                <w:sz w:val="18"/>
+              </w:rPr>
+              <w:t>Basler blaze 1 579 EUR (6 890 zł); Lucid Helios2 1 645 EUR (7 177 zł)</w:t>
+            </w:r>
+          </w:p>
+        </w:tc>
+        <w:tc>
+          <w:tcPr>
+            <w:tcW w:type="dxa" w:w="2041"/>
+          </w:tcPr>
+          <w:p>
+            <w:r/>
+            <w:r>
+              <w:rPr>
+                <w:b w:val="0"/>
+                <w:sz w:val="18"/>
+              </w:rPr>
+              <w:t>zestaw typ 2 w PRz 10 000 zł</w:t>
+            </w:r>
+          </w:p>
+        </w:tc>
+        <w:tc>
+          <w:tcPr>
+            <w:tcW w:type="dxa" w:w="2381"/>
+          </w:tcPr>
+          <w:p>
+            <w:r/>
+            <w:r>
+              <w:rPr>
+                <w:b w:val="0"/>
+                <w:sz w:val="18"/>
+              </w:rPr>
+              <w:t>Spójne jako zestaw z zasilaniem PoE, uchwytem i kablami.</w:t>
+            </w:r>
+          </w:p>
+        </w:tc>
+      </w:tr>
+      <w:tr>
+        <w:tc>
+          <w:tcPr>
+            <w:tcW w:type="dxa" w:w="1814"/>
+          </w:tcPr>
+          <w:p>
+            <w:r/>
+            <w:r>
+              <w:rPr>
+                <w:b w:val="0"/>
+                <w:sz w:val="18"/>
+              </w:rPr>
+              <w:t>Radar TI IWR6843AOPEVM (60 GHz)</w:t>
+            </w:r>
+          </w:p>
+        </w:tc>
+        <w:tc>
+          <w:tcPr>
+            <w:tcW w:type="dxa" w:w="3515"/>
+          </w:tcPr>
+          <w:p>
+            <w:r/>
+            <w:r>
+              <w:rPr>
+                <w:b w:val="0"/>
+                <w:sz w:val="18"/>
+              </w:rPr>
+              <w:t>Mouser 257,49 USD (979 zł); Digi-Key i TI bez ceny w wynikach</w:t>
+            </w:r>
+          </w:p>
+        </w:tc>
+        <w:tc>
+          <w:tcPr>
+            <w:tcW w:type="dxa" w:w="2041"/>
+          </w:tcPr>
+          <w:p>
+            <w:r/>
+            <w:r>
+              <w:rPr>
+                <w:b w:val="0"/>
+                <w:sz w:val="18"/>
+              </w:rPr>
+              <w:t>600 zł (Everest11 i PRz typ 1), 3 500 zł (PRz typ 2)</w:t>
+            </w:r>
+          </w:p>
+        </w:tc>
+        <w:tc>
+          <w:tcPr>
+            <w:tcW w:type="dxa" w:w="2381"/>
+          </w:tcPr>
+          <w:p>
+            <w:r/>
+            <w:r>
+              <w:rPr>
+                <w:b w:val="0"/>
+                <w:sz w:val="18"/>
+              </w:rPr>
+              <w:t>Typ 1 i Everest11 poniżej ceny karty o ok. 380 zł na sztukę. Pasmo 77 GHz z wniosku nie zgadza się z kartą 60 GHz (czeka dział techniczny).</w:t>
+            </w:r>
+          </w:p>
+        </w:tc>
+      </w:tr>
+      <w:tr>
+        <w:tc>
+          <w:tcPr>
+            <w:tcW w:type="dxa" w:w="1814"/>
+          </w:tcPr>
+          <w:p>
+            <w:r/>
+            <w:r>
+              <w:rPr>
+                <w:b w:val="0"/>
+                <w:sz w:val="18"/>
+              </w:rPr>
+              <w:t>Czujnik Sensirion SHT40</w:t>
+            </w:r>
+          </w:p>
+        </w:tc>
+        <w:tc>
+          <w:tcPr>
+            <w:tcW w:type="dxa" w:w="3515"/>
+          </w:tcPr>
+          <w:p>
+            <w:r/>
+            <w:r>
+              <w:rPr>
+                <w:b w:val="0"/>
+                <w:sz w:val="18"/>
+              </w:rPr>
+              <w:t>Farnell FR ok. 7,80 EUR (34 zł); core-electronics 14,30 AUD</w:t>
+            </w:r>
+          </w:p>
+        </w:tc>
+        <w:tc>
+          <w:tcPr>
+            <w:tcW w:type="dxa" w:w="2041"/>
+          </w:tcPr>
+          <w:p>
+            <w:r/>
+            <w:r>
+              <w:rPr>
+                <w:b w:val="0"/>
+                <w:sz w:val="18"/>
+              </w:rPr>
+              <w:t>300 zł (moduł multi-point)</w:t>
+            </w:r>
+          </w:p>
+        </w:tc>
+        <w:tc>
+          <w:tcPr>
+            <w:tcW w:type="dxa" w:w="2381"/>
+          </w:tcPr>
+          <w:p>
+            <w:r/>
+            <w:r>
+              <w:rPr>
+                <w:b w:val="0"/>
+                <w:sz w:val="18"/>
+              </w:rPr>
+              <w:t>Z zapasem.</w:t>
+            </w:r>
+          </w:p>
+        </w:tc>
+      </w:tr>
+      <w:tr>
+        <w:tc>
+          <w:tcPr>
+            <w:tcW w:type="dxa" w:w="1814"/>
+          </w:tcPr>
+          <w:p>
+            <w:r/>
+            <w:r>
+              <w:rPr>
+                <w:b w:val="0"/>
+                <w:sz w:val="18"/>
+              </w:rPr>
+              <w:t>Jednostka AI Jetson Orin Nano 8 GB</w:t>
+            </w:r>
+          </w:p>
+        </w:tc>
+        <w:tc>
+          <w:tcPr>
+            <w:tcW w:type="dxa" w:w="3515"/>
+          </w:tcPr>
+          <w:p>
+            <w:r/>
+            <w:r>
+              <w:rPr>
+                <w:b w:val="0"/>
+                <w:sz w:val="18"/>
+              </w:rPr>
+              <w:t>reichelt 1 396,51 zł (moduł); NVIDIA 399 USD przy 1KU+ (1 517 zł); zestaw reComputer J3011 z płytą nośną 2 425 zł (reichelt); Botland J3010 (4 GB) 2 799 zł</w:t>
+            </w:r>
+          </w:p>
+        </w:tc>
+        <w:tc>
+          <w:tcPr>
+            <w:tcW w:type="dxa" w:w="2041"/>
+          </w:tcPr>
+          <w:p>
+            <w:r/>
+            <w:r>
+              <w:rPr>
+                <w:b w:val="0"/>
+                <w:sz w:val="18"/>
+              </w:rPr>
+              <w:t>1 400 zł</w:t>
+            </w:r>
+          </w:p>
+        </w:tc>
+        <w:tc>
+          <w:tcPr>
+            <w:tcW w:type="dxa" w:w="2381"/>
+          </w:tcPr>
+          <w:p>
+            <w:r/>
+            <w:r>
+              <w:rPr>
+                <w:b w:val="0"/>
+                <w:sz w:val="18"/>
+              </w:rPr>
+              <w:t>Cena modułu. Płyta nośna i obudowa nie są w E5, ryzyko ok. 1 000 zł na komplet (czeka dział techniczny).</w:t>
+            </w:r>
+          </w:p>
+        </w:tc>
+      </w:tr>
+      <w:tr>
+        <w:tc>
+          <w:tcPr>
+            <w:tcW w:type="dxa" w:w="1814"/>
+          </w:tcPr>
+          <w:p>
+            <w:r/>
+            <w:r>
+              <w:rPr>
+                <w:b w:val="0"/>
+                <w:sz w:val="18"/>
+              </w:rPr>
+              <w:t>Dysk NVMe Kingston NV3 1 TB</w:t>
+            </w:r>
+          </w:p>
+        </w:tc>
+        <w:tc>
+          <w:tcPr>
+            <w:tcW w:type="dxa" w:w="3515"/>
+          </w:tcPr>
+          <w:p>
+            <w:r/>
+            <w:r>
+              <w:rPr>
+                <w:b w:val="0"/>
+                <w:sz w:val="18"/>
+              </w:rPr>
+              <w:t>x-kom 629 zł brutto (511 zł netto); Morele 429 zł brutto (349 zł netto); USA 164 do 201 USD</w:t>
+            </w:r>
+          </w:p>
+        </w:tc>
+        <w:tc>
+          <w:tcPr>
+            <w:tcW w:type="dxa" w:w="2041"/>
+          </w:tcPr>
+          <w:p>
+            <w:r/>
+            <w:r>
+              <w:rPr>
+                <w:b w:val="0"/>
+                <w:sz w:val="18"/>
+              </w:rPr>
+              <w:t>400 zł</w:t>
+            </w:r>
+          </w:p>
+        </w:tc>
+        <w:tc>
+          <w:tcPr>
+            <w:tcW w:type="dxa" w:w="2381"/>
+          </w:tcPr>
+          <w:p>
+            <w:r/>
+            <w:r>
+              <w:rPr>
+                <w:b w:val="0"/>
+                <w:sz w:val="18"/>
+              </w:rPr>
+              <w:t>W przedziale, ale zakres temperatur 0 do 70 °C (czeka dział techniczny).</w:t>
+            </w:r>
+          </w:p>
+        </w:tc>
+      </w:tr>
+      <w:tr>
+        <w:tc>
+          <w:tcPr>
+            <w:tcW w:type="dxa" w:w="1814"/>
+          </w:tcPr>
+          <w:p>
+            <w:r/>
+            <w:r>
+              <w:rPr>
+                <w:b w:val="0"/>
+                <w:sz w:val="18"/>
+              </w:rPr>
+              <w:t>Router Teltonika RUT956</w:t>
+            </w:r>
+          </w:p>
+        </w:tc>
+        <w:tc>
+          <w:tcPr>
+            <w:tcW w:type="dxa" w:w="3515"/>
+          </w:tcPr>
+          <w:p>
+            <w:r/>
+            <w:r>
+              <w:rPr>
+                <w:b w:val="0"/>
+                <w:sz w:val="18"/>
+              </w:rPr>
+              <w:t>mysky-shop 1 444 zł brutto (1 174 zł netto); eBay.de 239,90 EUR brutto (ok. 880 zł netto); Mediamarkt.ch 247,85 CHF</w:t>
+            </w:r>
+          </w:p>
+        </w:tc>
+        <w:tc>
+          <w:tcPr>
+            <w:tcW w:type="dxa" w:w="2041"/>
+          </w:tcPr>
+          <w:p>
+            <w:r/>
+            <w:r>
+              <w:rPr>
+                <w:b w:val="0"/>
+                <w:sz w:val="18"/>
+              </w:rPr>
+              <w:t>1 200 zł (Everest11), 1 500 zł (PRz)</w:t>
+            </w:r>
+          </w:p>
+        </w:tc>
+        <w:tc>
+          <w:tcPr>
+            <w:tcW w:type="dxa" w:w="2381"/>
+          </w:tcPr>
+          <w:p>
+            <w:r/>
+            <w:r>
+              <w:rPr>
+                <w:b w:val="0"/>
+                <w:sz w:val="18"/>
+              </w:rPr>
+              <w:t>W przedziale.</w:t>
+            </w:r>
+          </w:p>
+        </w:tc>
+      </w:tr>
+      <w:tr>
+        <w:tc>
+          <w:tcPr>
+            <w:tcW w:type="dxa" w:w="1814"/>
+          </w:tcPr>
+          <w:p>
+            <w:r/>
+            <w:r>
+              <w:rPr>
+                <w:b w:val="0"/>
+                <w:sz w:val="18"/>
+              </w:rPr>
+              <w:t>Obudowy IP67</w:t>
+            </w:r>
+          </w:p>
+        </w:tc>
+        <w:tc>
+          <w:tcPr>
+            <w:tcW w:type="dxa" w:w="3515"/>
+          </w:tcPr>
+          <w:p>
+            <w:r/>
+            <w:r>
+              <w:rPr>
+                <w:b w:val="0"/>
+                <w:sz w:val="18"/>
+              </w:rPr>
+              <w:t>RS 260 x 160 x 90 mm 411,59 zł; TME Gainta 160 x 160 x 90 mm 18,64 USD (71 zł); TME 160 x 240 x 90 mm 26,02 USD; RS PRO 160 x 80 x 60 mm 25,93 EUR</w:t>
+            </w:r>
+          </w:p>
+        </w:tc>
+        <w:tc>
+          <w:tcPr>
+            <w:tcW w:type="dxa" w:w="2041"/>
+          </w:tcPr>
+          <w:p>
+            <w:r/>
+            <w:r>
+              <w:rPr>
+                <w:b w:val="0"/>
+                <w:sz w:val="18"/>
+              </w:rPr>
+              <w:t>2 000 zł za komplet z przewodami, złączami M12 i peszlami (Everest11)</w:t>
+            </w:r>
+          </w:p>
+        </w:tc>
+        <w:tc>
+          <w:tcPr>
+            <w:tcW w:type="dxa" w:w="2381"/>
+          </w:tcPr>
+          <w:p>
+            <w:r/>
+            <w:r>
+              <w:rPr>
+                <w:b w:val="0"/>
+                <w:sz w:val="18"/>
+              </w:rPr>
+              <w:t>Wiarygodne dla kompletu z okablowaniem.</w:t>
+            </w:r>
+          </w:p>
+        </w:tc>
+      </w:tr>
+      <w:tr>
+        <w:tc>
+          <w:tcPr>
+            <w:tcW w:type="dxa" w:w="1814"/>
+          </w:tcPr>
+          <w:p>
+            <w:r/>
+            <w:r>
+              <w:rPr>
+                <w:b w:val="0"/>
+                <w:sz w:val="18"/>
+              </w:rPr>
+              <w:t>Przetwornica DC-DC 9-36 V na 12 V</w:t>
+            </w:r>
+          </w:p>
+        </w:tc>
+        <w:tc>
+          <w:tcPr>
+            <w:tcW w:type="dxa" w:w="3515"/>
+          </w:tcPr>
+          <w:p>
+            <w:r/>
+            <w:r>
+              <w:rPr>
+                <w:b w:val="0"/>
+                <w:sz w:val="18"/>
+              </w:rPr>
+              <w:t>RS XP Power 10 W 144,09 zł; TDK-Lambda 6 W 98,42 zł; Tracopower 4 W 62,86 zł</w:t>
+            </w:r>
+          </w:p>
+        </w:tc>
+        <w:tc>
+          <w:tcPr>
+            <w:tcW w:type="dxa" w:w="2041"/>
+          </w:tcPr>
+          <w:p>
+            <w:r/>
+            <w:r>
+              <w:rPr>
+                <w:b w:val="0"/>
+                <w:sz w:val="18"/>
+              </w:rPr>
+              <w:t>500 zł z UPS supercap</w:t>
+            </w:r>
+          </w:p>
+        </w:tc>
+        <w:tc>
+          <w:tcPr>
+            <w:tcW w:type="dxa" w:w="2381"/>
+          </w:tcPr>
+          <w:p>
+            <w:r/>
+            <w:r>
+              <w:rPr>
+                <w:b w:val="0"/>
+                <w:sz w:val="18"/>
+              </w:rPr>
+              <w:t>Moduł UPS supercap bez ceny w wynikach, kwota prawdopodobna.</w:t>
+            </w:r>
+          </w:p>
+        </w:tc>
+      </w:tr>
+      <w:tr>
+        <w:tc>
+          <w:tcPr>
+            <w:tcW w:type="dxa" w:w="1814"/>
+          </w:tcPr>
+          <w:p>
+            <w:r/>
+            <w:r>
+              <w:rPr>
+                <w:b w:val="0"/>
+                <w:sz w:val="18"/>
+              </w:rPr>
+              <w:t>Switch przemysłowy PoE+ 10-port</w:t>
+            </w:r>
+          </w:p>
+        </w:tc>
+        <w:tc>
+          <w:tcPr>
+            <w:tcW w:type="dxa" w:w="3515"/>
+          </w:tcPr>
+          <w:p>
+            <w:r/>
+            <w:r>
+              <w:rPr>
+                <w:b w:val="0"/>
+                <w:sz w:val="18"/>
+              </w:rPr>
+              <w:t>Moxa EDS-P510A (zarządzalny) 1 922,53 EUR (8 388 zł), RS</w:t>
+            </w:r>
+          </w:p>
+        </w:tc>
+        <w:tc>
+          <w:tcPr>
+            <w:tcW w:type="dxa" w:w="2041"/>
+          </w:tcPr>
+          <w:p>
+            <w:r/>
+            <w:r>
+              <w:rPr>
+                <w:b w:val="0"/>
+                <w:sz w:val="18"/>
+              </w:rPr>
+              <w:t>1 000 zł (Everest11), 5 000 zł (PRz typ 2)</w:t>
+            </w:r>
+          </w:p>
+        </w:tc>
+        <w:tc>
+          <w:tcPr>
+            <w:tcW w:type="dxa" w:w="2381"/>
+          </w:tcPr>
+          <w:p>
+            <w:r/>
+            <w:r>
+              <w:rPr>
+                <w:b w:val="0"/>
+                <w:sz w:val="18"/>
+              </w:rPr>
+              <w:t>Kwota zakłada switch niezarządzalny, o czym dział techniczny musi potwierdzić; dla zarządzalnego będzie dopłata własna.</w:t>
+            </w:r>
+          </w:p>
+        </w:tc>
+      </w:tr>
+      <w:tr>
+        <w:tc>
+          <w:tcPr>
+            <w:tcW w:type="dxa" w:w="1814"/>
+          </w:tcPr>
+          <w:p>
+            <w:r/>
+            <w:r>
+              <w:rPr>
+                <w:b w:val="0"/>
+                <w:sz w:val="18"/>
+              </w:rPr>
+              <w:t>Moduł laserowy linii 650 nm i soczewka Powell</w:t>
+            </w:r>
+          </w:p>
+        </w:tc>
+        <w:tc>
+          <w:tcPr>
+            <w:tcW w:type="dxa" w:w="3515"/>
+          </w:tcPr>
+          <w:p>
+            <w:r/>
+            <w:r>
+              <w:rPr>
+                <w:b w:val="0"/>
+                <w:sz w:val="18"/>
+              </w:rPr>
+              <w:t>Picotronic 5 mW 16,71 EUR (73 zł); moduły z soczewką Powell 1 033 do 1 193 EUR (4 509 do 5 206 zł)</w:t>
+            </w:r>
+          </w:p>
+        </w:tc>
+        <w:tc>
+          <w:tcPr>
+            <w:tcW w:type="dxa" w:w="2041"/>
+          </w:tcPr>
+          <w:p>
+            <w:r/>
+            <w:r>
+              <w:rPr>
+                <w:b w:val="0"/>
+                <w:sz w:val="18"/>
+              </w:rPr>
+              <w:t>laser 400 zł, soczewka 200 zł, sterownik 300 zł</w:t>
+            </w:r>
+          </w:p>
+        </w:tc>
+        <w:tc>
+          <w:tcPr>
+            <w:tcW w:type="dxa" w:w="2381"/>
+          </w:tcPr>
+          <w:p>
+            <w:r/>
+            <w:r>
+              <w:rPr>
+                <w:b w:val="0"/>
+                <w:sz w:val="18"/>
+              </w:rPr>
+              <w:t>Między klasą prostą a zawodową. Zależy od wymaganej jakości linii.</w:t>
+            </w:r>
+          </w:p>
+        </w:tc>
+      </w:tr>
+    </w:tbl>
+    <w:p/>
+    <w:p>
+      <w:pPr>
+        <w:pStyle w:val="Heading1"/>
+      </w:pPr>
+      <w:r>
+        <w:t>7. Zadania po Twojej stronie</w:t>
       </w:r>
     </w:p>
     <w:tbl>
@@ -4127,7 +5028,7 @@
                 <w:b w:val="0"/>
                 <w:sz w:val="18"/>
               </w:rPr>
-              <w:t>D06: typ i liczba kamer. Teksty zakładają 1 komplet kamer ToF i EO na pojazd (3 pojazdy i 1 komplet rezerwowy) oraz konfigurację 3-4 kamer badaną w laboratorium PRz, oznaczone gwiazdką. Kamera typu 1 w PRz jest opisana jako kamera głębi z aktywnym oświetleniem IR klasy podstawowej*, bo OAK-D Pro W to active stereo.</w:t>
+              <w:t>Czekamy na dział techniczny: (a) D06, typ i liczba kamer (teksty mają gwiazdkę), (b) klasa dysku NVMe (konsumencki 0 do 70 °C czy przemysłowy, różnica ok. 3,8 tys. zł na komplet), (c) pasmo i klasa radaru (77 GHz z wniosku a karta 60 GHz, ok. 980 zł), (d) czy jednostka AI jest modułem z płytą nośną (ok. 1 000 zł na komplet więcej), (e) klasa switcha PoE+ (niezarządzalny czy zarządzalny). Po odpowiedzi przeliczę kompensatę w obrębie członka konsorcjum.</w:t>
             </w:r>
           </w:p>
         </w:tc>
@@ -4174,7 +5075,7 @@
                 <w:b w:val="0"/>
                 <w:sz w:val="18"/>
               </w:rPr>
-              <w:t>Dysk NVMe w platformie edge AI (E5): zakres temperatur dysku konsumenckiego (0 do 70 °C) jest węższy niż wymagana praca od -25 do +70 °C. Przy dysku przemysłowym komplet kosztuje o ok. 3,8 tys. zł więcej (E09). Potwierdź klasę dysku. Jeśli ma być przemysłowy, napisz mi, a przeliczę kompensatę.</w:t>
+              <w:t>Zakupy Everest11 i PRz: przed złożeniem sprawdzić w wymienionych sklepach, że ceny nie są wyższe niż w tabeli z części 6. Dla pozycji, w których dostawcy są wskazani bez ceny (np. IMU, UPS supercap, LED, minikomputery PRz), ceny trzeba potwierdzić, a jeśli będą wyższe, dać znać, bo to zmienia kompensatę.</w:t>
             </w:r>
           </w:p>
         </w:tc>
@@ -4189,7 +5090,7 @@
                 <w:b w:val="0"/>
                 <w:sz w:val="18"/>
               </w:rPr>
-              <w:t>Dział techniczny</w:t>
+              <w:t>Everest11, PRz</w:t>
             </w:r>
           </w:p>
         </w:tc>
@@ -4221,7 +5122,7 @@
                 <w:b w:val="0"/>
                 <w:sz w:val="18"/>
               </w:rPr>
-              <w:t>Radar mmWave (E3): wniosek mówi o paśmie 77 GHz, a cena 600 zł jest niższa niż katalogowa karta TI IWR6843AOPEVM (pasmo 60 GHz, ok. 760 do 980 zł). Potwierdź pasmo i klasę modułu. Zmiana pasma wymaga poprawek w 7 miejscach wniosku (N54), a zmiana ceny kompensaty w obrębie Everest11.</w:t>
+              <w:t>Księgowa potwierdziła politykę rachunkowości (jednorazowy odpis kompletów do 10 000 zł) dla Everest11 i PRz. Symbole KŚT nie są wymagane w polach LSI, więc teksty ich nie zawierają; księgowa wpisze je w ewidencji środków trwałych.</w:t>
             </w:r>
           </w:p>
         </w:tc>
@@ -4236,7 +5137,7 @@
                 <w:b w:val="0"/>
                 <w:sz w:val="18"/>
               </w:rPr>
-              <w:t>Dział techniczny</w:t>
+              <w:t>Księgowa (potwierdzone)</w:t>
             </w:r>
           </w:p>
         </w:tc>
@@ -4268,7 +5169,7 @@
                 <w:b w:val="0"/>
                 <w:sz w:val="18"/>
               </w:rPr>
-              <w:t>Oferty na platformę edge AI: ceny w tekście to cenniki sklepów i producenta. Instrukcja chce w metodzie liczby zapytanych dostawców, odpowiedzi i kwot, więc jeśli Everest11 pobierze 2-3 oferty (Botland, Kamami, Elmark), podmień zdanie o źródle ceny.</w:t>
+              <w:t>Miesiące wykorzystania: zakupy w pierwszym miesiącu każdego zadania (ustalone). Everest11 Z2 i PRz Z1 od M1 do M30, czyli 30 miesięcy, PRz Z3 od M6 do M30, czyli 25 miesięcy.</w:t>
             </w:r>
           </w:p>
         </w:tc>
@@ -4283,101 +5184,7 @@
                 <w:b w:val="0"/>
                 <w:sz w:val="18"/>
               </w:rPr>
-              <w:t>Everest11, zakupy</w:t>
-            </w:r>
-          </w:p>
-        </w:tc>
-      </w:tr>
-      <w:tr>
-        <w:tc>
-          <w:tcPr>
-            <w:tcW w:type="dxa" w:w="567"/>
-          </w:tcPr>
-          <w:p>
-            <w:r/>
-            <w:r>
-              <w:rPr>
-                <w:b w:val="0"/>
-                <w:sz w:val="18"/>
-              </w:rPr>
-              <w:t>5</w:t>
-            </w:r>
-          </w:p>
-        </w:tc>
-        <w:tc>
-          <w:tcPr>
-            <w:tcW w:type="dxa" w:w="7200"/>
-          </w:tcPr>
-          <w:p>
-            <w:r/>
-            <w:r>
-              <w:rPr>
-                <w:b w:val="0"/>
-                <w:sz w:val="18"/>
-              </w:rPr>
-              <w:t>Księgowa: (a) potwierdzenie, że polityka rachunkowości Everest11 i PRz pozwala ująć każdy komplet jako środek trwały i odpisać go jednorazowo do 10 000 zł, (b) symbol KŚT każdego kompletu do ewidencji (Instrukcja nie wymaga go w polu, ale ekspert o niego pytał), (c) tryb likwidacji po M30 (protokół likwidacji).</w:t>
-            </w:r>
-          </w:p>
-        </w:tc>
-        <w:tc>
-          <w:tcPr>
-            <w:tcW w:type="dxa" w:w="1984"/>
-          </w:tcPr>
-          <w:p>
-            <w:r/>
-            <w:r>
-              <w:rPr>
-                <w:b w:val="0"/>
-                <w:sz w:val="18"/>
-              </w:rPr>
-              <w:t>Księgowa Everest11, księgowość PRz</w:t>
-            </w:r>
-          </w:p>
-        </w:tc>
-      </w:tr>
-      <w:tr>
-        <w:tc>
-          <w:tcPr>
-            <w:tcW w:type="dxa" w:w="567"/>
-          </w:tcPr>
-          <w:p>
-            <w:r/>
-            <w:r>
-              <w:rPr>
-                <w:b w:val="0"/>
-                <w:sz w:val="18"/>
-              </w:rPr>
-              <w:t>6</w:t>
-            </w:r>
-          </w:p>
-        </w:tc>
-        <w:tc>
-          <w:tcPr>
-            <w:tcW w:type="dxa" w:w="7200"/>
-          </w:tcPr>
-          <w:p>
-            <w:r/>
-            <w:r>
-              <w:rPr>
-                <w:b w:val="0"/>
-                <w:sz w:val="18"/>
-              </w:rPr>
-              <w:t>Miesiące wykorzystania w tekstach: Everest11 od M10 (08.2027), bo tor pomiarowy powstaje według specyfikacji z Z1 (koniec w M9), czyli 21 miesięcy do M30; PRz Z1 od M2, czyli 29 miesięcy; PRz Z3 od M6, czyli 25 miesięcy. Jeśli zakupy są planowane inaczej, zmień liczbę miesięcy.</w:t>
-            </w:r>
-          </w:p>
-        </w:tc>
-        <w:tc>
-          <w:tcPr>
-            <w:tcW w:type="dxa" w:w="1984"/>
-          </w:tcPr>
-          <w:p>
-            <w:r/>
-            <w:r>
-              <w:rPr>
-                <w:b w:val="0"/>
-                <w:sz w:val="18"/>
-              </w:rPr>
-              <w:t>Ty, PRz</w:t>
+              <w:t>Ustalone</w:t>
             </w:r>
           </w:p>
         </w:tc>
@@ -4389,7 +5196,7 @@
         <w:pStyle w:val="Heading1"/>
       </w:pPr>
       <w:r>
-        <w:t>7. Pokrycie uwag</w:t>
+        <w:t>8. Pokrycie uwag</w:t>
       </w:r>
     </w:p>
     <w:tbl>
@@ -4539,7 +5346,7 @@
                 <w:b w:val="0"/>
                 <w:sz w:val="18"/>
               </w:rPr>
-              <w:t>Gotowe, po potwierdzeniu dysku i ofert (część 6, pkt 2 i 4)</w:t>
+              <w:t>Gotowe, po odpowiedzi działu technicznego (część 7, pkt 1)</w:t>
             </w:r>
           </w:p>
         </w:tc>
@@ -4586,7 +5393,7 @@
                 <w:b w:val="0"/>
                 <w:sz w:val="18"/>
               </w:rPr>
-              <w:t>Gotowe, KŚT od księgowej (część 6, pkt 5)</w:t>
+              <w:t>Gotowe</w:t>
             </w:r>
           </w:p>
         </w:tc>
@@ -4759,7 +5566,7 @@
                 <w:b w:val="0"/>
                 <w:sz w:val="18"/>
               </w:rPr>
-              <w:t>E1 do E7, część 6 pkt 1</w:t>
+              <w:t>E1 do E7, część 7 pkt 1</w:t>
             </w:r>
           </w:p>
         </w:tc>
@@ -4774,7 +5581,7 @@
                 <w:b w:val="0"/>
                 <w:sz w:val="18"/>
               </w:rPr>
-              <w:t>Gotowe, po decyzji D06</w:t>
+              <w:t>Gotowe z gwiazdką do decyzji D06</w:t>
             </w:r>
           </w:p>
         </w:tc>

</xml_diff>